<commit_message>
feat: add live event dashboard
</commit_message>
<xml_diff>
--- a/submission/AgentGuard-技术报告.docx
+++ b/submission/AgentGuard-技术报告.docx
@@ -708,7 +708,23 @@
       </w:r>
       <w:r>
         <w:rPr/>
-        <w:t>作为可选通道。</w:t>
+        <w:t xml:space="preserve">作为可选通道，并提供每 </w:t>
+      </w:r>
+      <w:r>
+        <w:rPr/>
+        <w:t xml:space="preserve">2 </w:t>
+      </w:r>
+      <w:r>
+        <w:rPr/>
+        <w:t xml:space="preserve">秒刷新的本地事件统计面板和 </w:t>
+      </w:r>
+      <w:r>
+        <w:rPr/>
+        <w:t xml:space="preserve">CSV </w:t>
+      </w:r>
+      <w:r>
+        <w:rPr/>
+        <w:t>导出。</w:t>
       </w:r>
     </w:p>
     <w:p>
@@ -2106,15 +2122,15 @@
         </w:tblCellMar>
       </w:tblPr>
       <w:tblGrid>
-        <w:gridCol w:w="1366"/>
+        <w:gridCol w:w="1015"/>
         <w:gridCol w:w="5866"/>
-        <w:gridCol w:w="2634"/>
+        <w:gridCol w:w="2985"/>
       </w:tblGrid>
       <w:tr>
         <w:trPr/>
         <w:tc>
           <w:tcPr>
-            <w:tcW w:w="1366" w:type="dxa"/>
+            <w:tcW w:w="1015" w:type="dxa"/>
             <w:tcBorders/>
             <w:vAlign w:val="center"/>
           </w:tcPr>
@@ -2154,7 +2170,7 @@
         </w:tc>
         <w:tc>
           <w:tcPr>
-            <w:tcW w:w="2634" w:type="dxa"/>
+            <w:tcW w:w="2985" w:type="dxa"/>
             <w:tcBorders/>
             <w:vAlign w:val="center"/>
           </w:tcPr>
@@ -2177,7 +2193,7 @@
         <w:trPr/>
         <w:tc>
           <w:tcPr>
-            <w:tcW w:w="1366" w:type="dxa"/>
+            <w:tcW w:w="1015" w:type="dxa"/>
             <w:tcBorders/>
             <w:vAlign w:val="center"/>
           </w:tcPr>
@@ -2227,7 +2243,7 @@
         </w:tc>
         <w:tc>
           <w:tcPr>
-            <w:tcW w:w="2634" w:type="dxa"/>
+            <w:tcW w:w="2985" w:type="dxa"/>
             <w:tcBorders/>
             <w:vAlign w:val="center"/>
           </w:tcPr>
@@ -2252,7 +2268,7 @@
         <w:trPr/>
         <w:tc>
           <w:tcPr>
-            <w:tcW w:w="1366" w:type="dxa"/>
+            <w:tcW w:w="1015" w:type="dxa"/>
             <w:tcBorders/>
             <w:vAlign w:val="center"/>
           </w:tcPr>
@@ -2302,7 +2318,7 @@
         </w:tc>
         <w:tc>
           <w:tcPr>
-            <w:tcW w:w="2634" w:type="dxa"/>
+            <w:tcW w:w="2985" w:type="dxa"/>
             <w:tcBorders/>
             <w:vAlign w:val="center"/>
           </w:tcPr>
@@ -2327,7 +2343,7 @@
         <w:trPr/>
         <w:tc>
           <w:tcPr>
-            <w:tcW w:w="1366" w:type="dxa"/>
+            <w:tcW w:w="1015" w:type="dxa"/>
             <w:tcBorders/>
             <w:vAlign w:val="center"/>
           </w:tcPr>
@@ -2381,7 +2397,7 @@
         </w:tc>
         <w:tc>
           <w:tcPr>
-            <w:tcW w:w="2634" w:type="dxa"/>
+            <w:tcW w:w="2985" w:type="dxa"/>
             <w:tcBorders/>
             <w:vAlign w:val="center"/>
           </w:tcPr>
@@ -2406,7 +2422,7 @@
         <w:trPr/>
         <w:tc>
           <w:tcPr>
-            <w:tcW w:w="1366" w:type="dxa"/>
+            <w:tcW w:w="1015" w:type="dxa"/>
             <w:tcBorders/>
             <w:vAlign w:val="center"/>
           </w:tcPr>
@@ -2462,7 +2478,7 @@
         </w:tc>
         <w:tc>
           <w:tcPr>
-            <w:tcW w:w="2634" w:type="dxa"/>
+            <w:tcW w:w="2985" w:type="dxa"/>
             <w:tcBorders/>
             <w:vAlign w:val="center"/>
           </w:tcPr>
@@ -2495,7 +2511,7 @@
         <w:trPr/>
         <w:tc>
           <w:tcPr>
-            <w:tcW w:w="1366" w:type="dxa"/>
+            <w:tcW w:w="1015" w:type="dxa"/>
             <w:tcBorders/>
             <w:vAlign w:val="center"/>
           </w:tcPr>
@@ -2533,7 +2549,7 @@
             </w:pPr>
             <w:r>
               <w:rPr/>
-              <w:t xml:space="preserve">2,414,764 </w:t>
+              <w:t xml:space="preserve">2,414,732 </w:t>
             </w:r>
             <w:r>
               <w:rPr/>
@@ -2543,7 +2559,7 @@
         </w:tc>
         <w:tc>
           <w:tcPr>
-            <w:tcW w:w="2634" w:type="dxa"/>
+            <w:tcW w:w="2985" w:type="dxa"/>
             <w:tcBorders/>
             <w:vAlign w:val="center"/>
           </w:tcPr>
@@ -2582,7 +2598,7 @@
         <w:trPr/>
         <w:tc>
           <w:tcPr>
-            <w:tcW w:w="1366" w:type="dxa"/>
+            <w:tcW w:w="1015" w:type="dxa"/>
             <w:tcBorders/>
             <w:vAlign w:val="center"/>
           </w:tcPr>
@@ -2626,7 +2642,7 @@
         </w:tc>
         <w:tc>
           <w:tcPr>
-            <w:tcW w:w="2634" w:type="dxa"/>
+            <w:tcW w:w="2985" w:type="dxa"/>
             <w:tcBorders/>
             <w:vAlign w:val="center"/>
           </w:tcPr>
@@ -2659,7 +2675,7 @@
         <w:trPr/>
         <w:tc>
           <w:tcPr>
-            <w:tcW w:w="1366" w:type="dxa"/>
+            <w:tcW w:w="1015" w:type="dxa"/>
             <w:tcBorders/>
             <w:vAlign w:val="center"/>
           </w:tcPr>
@@ -2701,7 +2717,7 @@
             </w:pPr>
             <w:r>
               <w:rPr/>
-              <w:t>text 1,771,414</w:t>
+              <w:t>text 1,771,434</w:t>
             </w:r>
             <w:r>
               <w:rPr/>
@@ -2709,7 +2725,7 @@
             </w:r>
             <w:r>
               <w:rPr/>
-              <w:t>data 532,104</w:t>
+              <w:t>data 532,072</w:t>
             </w:r>
             <w:r>
               <w:rPr/>
@@ -2717,7 +2733,7 @@
             </w:r>
             <w:r>
               <w:rPr/>
-              <w:t xml:space="preserve">bss 961,976 </w:t>
+              <w:t xml:space="preserve">bss 961,944 </w:t>
             </w:r>
             <w:r>
               <w:rPr/>
@@ -2727,7 +2743,7 @@
         </w:tc>
         <w:tc>
           <w:tcPr>
-            <w:tcW w:w="2634" w:type="dxa"/>
+            <w:tcW w:w="2985" w:type="dxa"/>
             <w:tcBorders/>
             <w:vAlign w:val="center"/>
           </w:tcPr>
@@ -2762,23 +2778,23 @@
         <w:trPr/>
         <w:tc>
           <w:tcPr>
-            <w:tcW w:w="1366" w:type="dxa"/>
-            <w:tcBorders/>
-            <w:vAlign w:val="center"/>
-          </w:tcPr>
-          <w:p>
-            <w:pPr>
-              <w:pStyle w:val="TableContents"/>
-              <w:widowControl w:val="false"/>
-              <w:suppressLineNumbers/>
-              <w:bidi w:val="0"/>
-              <w:spacing w:lineRule="auto" w:line="336"/>
-              <w:jc w:val="start"/>
-              <w:rPr/>
-            </w:pPr>
-            <w:r>
-              <w:rPr/>
-              <w:t xml:space="preserve">最终验证固件 </w:t>
+            <w:tcW w:w="1015" w:type="dxa"/>
+            <w:tcBorders/>
+            <w:vAlign w:val="center"/>
+          </w:tcPr>
+          <w:p>
+            <w:pPr>
+              <w:pStyle w:val="TableContents"/>
+              <w:widowControl w:val="false"/>
+              <w:suppressLineNumbers/>
+              <w:bidi w:val="0"/>
+              <w:spacing w:lineRule="auto" w:line="336"/>
+              <w:jc w:val="start"/>
+              <w:rPr/>
+            </w:pPr>
+            <w:r>
+              <w:rPr/>
+              <w:t xml:space="preserve">最终固件 </w:t>
             </w:r>
             <w:r>
               <w:rPr/>
@@ -2806,29 +2822,37 @@
               <w:rPr>
                 <w:rStyle w:val="SourceText"/>
               </w:rPr>
-              <w:t>2fb4245c477c166d75b167c073520930253a3ce1df0e2c3bf70bd8bd03758244</w:t>
-            </w:r>
-          </w:p>
-        </w:tc>
-        <w:tc>
-          <w:tcPr>
-            <w:tcW w:w="2634" w:type="dxa"/>
-            <w:tcBorders/>
-            <w:vAlign w:val="center"/>
-          </w:tcPr>
-          <w:p>
-            <w:pPr>
-              <w:pStyle w:val="TableContents"/>
-              <w:widowControl w:val="false"/>
-              <w:suppressLineNumbers/>
-              <w:bidi w:val="0"/>
-              <w:spacing w:lineRule="auto" w:line="336"/>
-              <w:jc w:val="start"/>
-              <w:rPr/>
-            </w:pPr>
-            <w:r>
-              <w:rPr/>
-              <w:t>已刷写并实机验证确认事件转发</w:t>
+              <w:t>0f37a703e14aa3c38e1281606ac729114f69c3820d2cd74f91e177012139bf2b</w:t>
+            </w:r>
+          </w:p>
+        </w:tc>
+        <w:tc>
+          <w:tcPr>
+            <w:tcW w:w="2985" w:type="dxa"/>
+            <w:tcBorders/>
+            <w:vAlign w:val="center"/>
+          </w:tcPr>
+          <w:p>
+            <w:pPr>
+              <w:pStyle w:val="TableContents"/>
+              <w:widowControl w:val="false"/>
+              <w:suppressLineNumbers/>
+              <w:bidi w:val="0"/>
+              <w:spacing w:lineRule="auto" w:line="336"/>
+              <w:jc w:val="start"/>
+              <w:rPr/>
+            </w:pPr>
+            <w:r>
+              <w:rPr/>
+              <w:t xml:space="preserve">新模式底栏版本，已刷写且 </w:t>
+            </w:r>
+            <w:r>
+              <w:rPr/>
+              <w:t xml:space="preserve">Flash </w:t>
+            </w:r>
+            <w:r>
+              <w:rPr/>
+              <w:t>哈希验证通过</w:t>
             </w:r>
           </w:p>
         </w:tc>
@@ -2837,7 +2861,7 @@
         <w:trPr/>
         <w:tc>
           <w:tcPr>
-            <w:tcW w:w="1366" w:type="dxa"/>
+            <w:tcW w:w="1015" w:type="dxa"/>
             <w:tcBorders/>
             <w:vAlign w:val="center"/>
           </w:tcPr>
@@ -2881,7 +2905,7 @@
         </w:tc>
         <w:tc>
           <w:tcPr>
-            <w:tcW w:w="2634" w:type="dxa"/>
+            <w:tcW w:w="2985" w:type="dxa"/>
             <w:tcBorders/>
             <w:vAlign w:val="center"/>
           </w:tcPr>
@@ -2908,7 +2932,7 @@
         <w:trPr/>
         <w:tc>
           <w:tcPr>
-            <w:tcW w:w="1366" w:type="dxa"/>
+            <w:tcW w:w="1015" w:type="dxa"/>
             <w:tcBorders/>
             <w:vAlign w:val="center"/>
           </w:tcPr>
@@ -2946,7 +2970,7 @@
             </w:pPr>
             <w:r>
               <w:rPr/>
-              <w:t xml:space="preserve">16 </w:t>
+              <w:t xml:space="preserve">22 </w:t>
             </w:r>
             <w:r>
               <w:rPr/>
@@ -2956,7 +2980,7 @@
         </w:tc>
         <w:tc>
           <w:tcPr>
-            <w:tcW w:w="2634" w:type="dxa"/>
+            <w:tcW w:w="2985" w:type="dxa"/>
             <w:tcBorders/>
             <w:vAlign w:val="center"/>
           </w:tcPr>
@@ -2980,7 +3004,23 @@
             </w:r>
             <w:r>
               <w:rPr/>
-              <w:t>、日志和统计</w:t>
+              <w:t>、日志、今日</w:t>
+            </w:r>
+            <w:r>
+              <w:rPr/>
+              <w:t>/</w:t>
+            </w:r>
+            <w:r>
+              <w:rPr/>
+              <w:t>累计统计、面板、</w:t>
+            </w:r>
+            <w:r>
+              <w:rPr/>
+              <w:t xml:space="preserve">CSV </w:t>
+            </w:r>
+            <w:r>
+              <w:rPr/>
+              <w:t>和仅本机监听限制</w:t>
             </w:r>
           </w:p>
         </w:tc>
@@ -2989,7 +3029,7 @@
         <w:trPr/>
         <w:tc>
           <w:tcPr>
-            <w:tcW w:w="1366" w:type="dxa"/>
+            <w:tcW w:w="1015" w:type="dxa"/>
             <w:tcBorders/>
             <w:vAlign w:val="center"/>
           </w:tcPr>
@@ -3033,7 +3073,7 @@
         </w:tc>
         <w:tc>
           <w:tcPr>
-            <w:tcW w:w="2634" w:type="dxa"/>
+            <w:tcW w:w="2985" w:type="dxa"/>
             <w:tcBorders/>
             <w:vAlign w:val="center"/>
           </w:tcPr>
@@ -3062,7 +3102,7 @@
         <w:trPr/>
         <w:tc>
           <w:tcPr>
-            <w:tcW w:w="1366" w:type="dxa"/>
+            <w:tcW w:w="1015" w:type="dxa"/>
             <w:tcBorders/>
             <w:vAlign w:val="center"/>
           </w:tcPr>
@@ -3122,7 +3162,7 @@
         </w:tc>
         <w:tc>
           <w:tcPr>
-            <w:tcW w:w="2634" w:type="dxa"/>
+            <w:tcW w:w="2985" w:type="dxa"/>
             <w:tcBorders/>
             <w:vAlign w:val="center"/>
           </w:tcPr>

</xml_diff>

<commit_message>
docs: record final display verification
</commit_message>
<xml_diff>
--- a/submission/AgentGuard-技术报告.docx
+++ b/submission/AgentGuard-技术报告.docx
@@ -2122,15 +2122,15 @@
         </w:tblCellMar>
       </w:tblPr>
       <w:tblGrid>
-        <w:gridCol w:w="1015"/>
-        <w:gridCol w:w="5866"/>
-        <w:gridCol w:w="2985"/>
+        <w:gridCol w:w="1004"/>
+        <w:gridCol w:w="5925"/>
+        <w:gridCol w:w="2937"/>
       </w:tblGrid>
       <w:tr>
         <w:trPr/>
         <w:tc>
           <w:tcPr>
-            <w:tcW w:w="1015" w:type="dxa"/>
+            <w:tcW w:w="1004" w:type="dxa"/>
             <w:tcBorders/>
             <w:vAlign w:val="center"/>
           </w:tcPr>
@@ -2150,7 +2150,7 @@
         </w:tc>
         <w:tc>
           <w:tcPr>
-            <w:tcW w:w="5866" w:type="dxa"/>
+            <w:tcW w:w="5925" w:type="dxa"/>
             <w:tcBorders/>
             <w:vAlign w:val="center"/>
           </w:tcPr>
@@ -2170,7 +2170,7 @@
         </w:tc>
         <w:tc>
           <w:tcPr>
-            <w:tcW w:w="2985" w:type="dxa"/>
+            <w:tcW w:w="2937" w:type="dxa"/>
             <w:tcBorders/>
             <w:vAlign w:val="center"/>
           </w:tcPr>
@@ -2193,7 +2193,7 @@
         <w:trPr/>
         <w:tc>
           <w:tcPr>
-            <w:tcW w:w="1015" w:type="dxa"/>
+            <w:tcW w:w="1004" w:type="dxa"/>
             <w:tcBorders/>
             <w:vAlign w:val="center"/>
           </w:tcPr>
@@ -2215,7 +2215,7 @@
         </w:tc>
         <w:tc>
           <w:tcPr>
-            <w:tcW w:w="5866" w:type="dxa"/>
+            <w:tcW w:w="5925" w:type="dxa"/>
             <w:tcBorders/>
             <w:vAlign w:val="center"/>
           </w:tcPr>
@@ -2243,7 +2243,7 @@
         </w:tc>
         <w:tc>
           <w:tcPr>
-            <w:tcW w:w="2985" w:type="dxa"/>
+            <w:tcW w:w="2937" w:type="dxa"/>
             <w:tcBorders/>
             <w:vAlign w:val="center"/>
           </w:tcPr>
@@ -2268,7 +2268,7 @@
         <w:trPr/>
         <w:tc>
           <w:tcPr>
-            <w:tcW w:w="1015" w:type="dxa"/>
+            <w:tcW w:w="1004" w:type="dxa"/>
             <w:tcBorders/>
             <w:vAlign w:val="center"/>
           </w:tcPr>
@@ -2290,7 +2290,7 @@
         </w:tc>
         <w:tc>
           <w:tcPr>
-            <w:tcW w:w="5866" w:type="dxa"/>
+            <w:tcW w:w="5925" w:type="dxa"/>
             <w:tcBorders/>
             <w:vAlign w:val="center"/>
           </w:tcPr>
@@ -2318,7 +2318,7 @@
         </w:tc>
         <w:tc>
           <w:tcPr>
-            <w:tcW w:w="2985" w:type="dxa"/>
+            <w:tcW w:w="2937" w:type="dxa"/>
             <w:tcBorders/>
             <w:vAlign w:val="center"/>
           </w:tcPr>
@@ -2343,7 +2343,7 @@
         <w:trPr/>
         <w:tc>
           <w:tcPr>
-            <w:tcW w:w="1015" w:type="dxa"/>
+            <w:tcW w:w="1004" w:type="dxa"/>
             <w:tcBorders/>
             <w:vAlign w:val="center"/>
           </w:tcPr>
@@ -2365,7 +2365,7 @@
         </w:tc>
         <w:tc>
           <w:tcPr>
-            <w:tcW w:w="5866" w:type="dxa"/>
+            <w:tcW w:w="5925" w:type="dxa"/>
             <w:tcBorders/>
             <w:vAlign w:val="center"/>
           </w:tcPr>
@@ -2397,7 +2397,7 @@
         </w:tc>
         <w:tc>
           <w:tcPr>
-            <w:tcW w:w="2985" w:type="dxa"/>
+            <w:tcW w:w="2937" w:type="dxa"/>
             <w:tcBorders/>
             <w:vAlign w:val="center"/>
           </w:tcPr>
@@ -2422,87 +2422,103 @@
         <w:trPr/>
         <w:tc>
           <w:tcPr>
-            <w:tcW w:w="1015" w:type="dxa"/>
-            <w:tcBorders/>
-            <w:vAlign w:val="center"/>
-          </w:tcPr>
-          <w:p>
-            <w:pPr>
-              <w:pStyle w:val="TableContents"/>
-              <w:widowControl w:val="false"/>
-              <w:suppressLineNumbers/>
-              <w:bidi w:val="0"/>
-              <w:spacing w:lineRule="auto" w:line="336"/>
-              <w:jc w:val="start"/>
-              <w:rPr/>
-            </w:pPr>
-            <w:r>
-              <w:rPr/>
-              <w:t>单帧推理</w:t>
-            </w:r>
-          </w:p>
-        </w:tc>
-        <w:tc>
-          <w:tcPr>
-            <w:tcW w:w="5866" w:type="dxa"/>
-            <w:tcBorders/>
-            <w:vAlign w:val="center"/>
-          </w:tcPr>
-          <w:p>
-            <w:pPr>
-              <w:pStyle w:val="TableContents"/>
-              <w:widowControl w:val="false"/>
-              <w:suppressLineNumbers/>
-              <w:bidi w:val="0"/>
-              <w:spacing w:lineRule="auto" w:line="336"/>
-              <w:jc w:val="start"/>
-              <w:rPr/>
-            </w:pPr>
-            <w:r>
-              <w:rPr/>
-              <w:t xml:space="preserve">约 </w:t>
-            </w:r>
-            <w:r>
-              <w:rPr/>
-              <w:t>840 ms</w:t>
-            </w:r>
-            <w:r>
-              <w:rPr/>
-              <w:t xml:space="preserve">，约 </w:t>
-            </w:r>
-            <w:r>
-              <w:rPr/>
-              <w:t>1.19 FPS</w:t>
-            </w:r>
-          </w:p>
-        </w:tc>
-        <w:tc>
-          <w:tcPr>
-            <w:tcW w:w="2985" w:type="dxa"/>
-            <w:tcBorders/>
-            <w:vAlign w:val="center"/>
-          </w:tcPr>
-          <w:p>
-            <w:pPr>
-              <w:pStyle w:val="TableContents"/>
-              <w:widowControl w:val="false"/>
-              <w:suppressLineNumbers/>
-              <w:bidi w:val="0"/>
-              <w:spacing w:lineRule="auto" w:line="336"/>
-              <w:jc w:val="start"/>
-              <w:rPr/>
-            </w:pPr>
-            <w:r>
-              <w:rPr/>
-              <w:t>调试期间观测值，随画面</w:t>
-            </w:r>
-            <w:r>
-              <w:rPr/>
-              <w:t>/</w:t>
-            </w:r>
-            <w:r>
-              <w:rPr/>
-              <w:t>配置变化</w:t>
+            <w:tcW w:w="1004" w:type="dxa"/>
+            <w:tcBorders/>
+            <w:vAlign w:val="center"/>
+          </w:tcPr>
+          <w:p>
+            <w:pPr>
+              <w:pStyle w:val="TableContents"/>
+              <w:widowControl w:val="false"/>
+              <w:suppressLineNumbers/>
+              <w:bidi w:val="0"/>
+              <w:spacing w:lineRule="auto" w:line="336"/>
+              <w:jc w:val="start"/>
+              <w:rPr/>
+            </w:pPr>
+            <w:r>
+              <w:rPr/>
+              <w:t>最终界面</w:t>
+            </w:r>
+          </w:p>
+        </w:tc>
+        <w:tc>
+          <w:tcPr>
+            <w:tcW w:w="5925" w:type="dxa"/>
+            <w:tcBorders/>
+            <w:vAlign w:val="center"/>
+          </w:tcPr>
+          <w:p>
+            <w:pPr>
+              <w:pStyle w:val="TableContents"/>
+              <w:widowControl w:val="false"/>
+              <w:suppressLineNumbers/>
+              <w:bidi w:val="0"/>
+              <w:spacing w:lineRule="auto" w:line="336"/>
+              <w:jc w:val="start"/>
+              <w:rPr/>
+            </w:pPr>
+            <w:r>
+              <w:rPr/>
+              <w:t xml:space="preserve">摄像头画面正常；底栏显示 </w:t>
+            </w:r>
+            <w:r>
+              <w:rPr>
+                <w:rStyle w:val="SourceText"/>
+              </w:rPr>
+              <w:t>SIT</w:t>
+            </w:r>
+            <w:r>
+              <w:rPr/>
+              <w:t>、</w:t>
+            </w:r>
+            <w:r>
+              <w:rPr>
+                <w:rStyle w:val="SourceText"/>
+              </w:rPr>
+              <w:t>P:ON/OFF</w:t>
+            </w:r>
+            <w:r>
+              <w:rPr/>
+              <w:t>、</w:t>
+            </w:r>
+            <w:r>
+              <w:rPr>
+                <w:rStyle w:val="SourceText"/>
+              </w:rPr>
+              <w:t>D:ON/OFF</w:t>
+            </w:r>
+            <w:r>
+              <w:rPr/>
+              <w:t xml:space="preserve">，不再显示 </w:t>
+            </w:r>
+            <w:r>
+              <w:rPr>
+                <w:rStyle w:val="SourceText"/>
+              </w:rPr>
+              <w:t>KEY:1331</w:t>
+            </w:r>
+          </w:p>
+        </w:tc>
+        <w:tc>
+          <w:tcPr>
+            <w:tcW w:w="2937" w:type="dxa"/>
+            <w:tcBorders/>
+            <w:vAlign w:val="center"/>
+          </w:tcPr>
+          <w:p>
+            <w:pPr>
+              <w:pStyle w:val="TableContents"/>
+              <w:widowControl w:val="false"/>
+              <w:suppressLineNumbers/>
+              <w:bidi w:val="0"/>
+              <w:spacing w:lineRule="auto" w:line="336"/>
+              <w:jc w:val="start"/>
+              <w:rPr/>
+            </w:pPr>
+            <w:r>
+              <w:rPr/>
+              <w:t>最终固件刷写后实机人工验收</w:t>
             </w:r>
           </w:p>
         </w:tc>
@@ -2511,7 +2527,96 @@
         <w:trPr/>
         <w:tc>
           <w:tcPr>
-            <w:tcW w:w="1015" w:type="dxa"/>
+            <w:tcW w:w="1004" w:type="dxa"/>
+            <w:tcBorders/>
+            <w:vAlign w:val="center"/>
+          </w:tcPr>
+          <w:p>
+            <w:pPr>
+              <w:pStyle w:val="TableContents"/>
+              <w:widowControl w:val="false"/>
+              <w:suppressLineNumbers/>
+              <w:bidi w:val="0"/>
+              <w:spacing w:lineRule="auto" w:line="336"/>
+              <w:jc w:val="start"/>
+              <w:rPr/>
+            </w:pPr>
+            <w:r>
+              <w:rPr/>
+              <w:t>单帧推理</w:t>
+            </w:r>
+          </w:p>
+        </w:tc>
+        <w:tc>
+          <w:tcPr>
+            <w:tcW w:w="5925" w:type="dxa"/>
+            <w:tcBorders/>
+            <w:vAlign w:val="center"/>
+          </w:tcPr>
+          <w:p>
+            <w:pPr>
+              <w:pStyle w:val="TableContents"/>
+              <w:widowControl w:val="false"/>
+              <w:suppressLineNumbers/>
+              <w:bidi w:val="0"/>
+              <w:spacing w:lineRule="auto" w:line="336"/>
+              <w:jc w:val="start"/>
+              <w:rPr/>
+            </w:pPr>
+            <w:r>
+              <w:rPr/>
+              <w:t xml:space="preserve">约 </w:t>
+            </w:r>
+            <w:r>
+              <w:rPr/>
+              <w:t>840 ms</w:t>
+            </w:r>
+            <w:r>
+              <w:rPr/>
+              <w:t xml:space="preserve">，约 </w:t>
+            </w:r>
+            <w:r>
+              <w:rPr/>
+              <w:t>1.19 FPS</w:t>
+            </w:r>
+          </w:p>
+        </w:tc>
+        <w:tc>
+          <w:tcPr>
+            <w:tcW w:w="2937" w:type="dxa"/>
+            <w:tcBorders/>
+            <w:vAlign w:val="center"/>
+          </w:tcPr>
+          <w:p>
+            <w:pPr>
+              <w:pStyle w:val="TableContents"/>
+              <w:widowControl w:val="false"/>
+              <w:suppressLineNumbers/>
+              <w:bidi w:val="0"/>
+              <w:spacing w:lineRule="auto" w:line="336"/>
+              <w:jc w:val="start"/>
+              <w:rPr/>
+            </w:pPr>
+            <w:r>
+              <w:rPr/>
+              <w:t>调试期间观测值，随画面</w:t>
+            </w:r>
+            <w:r>
+              <w:rPr/>
+              <w:t>/</w:t>
+            </w:r>
+            <w:r>
+              <w:rPr/>
+              <w:t>配置变化</w:t>
+            </w:r>
+          </w:p>
+        </w:tc>
+      </w:tr>
+      <w:tr>
+        <w:trPr/>
+        <w:tc>
+          <w:tcPr>
+            <w:tcW w:w="1004" w:type="dxa"/>
             <w:tcBorders/>
             <w:vAlign w:val="center"/>
           </w:tcPr>
@@ -2533,7 +2638,7 @@
         </w:tc>
         <w:tc>
           <w:tcPr>
-            <w:tcW w:w="5866" w:type="dxa"/>
+            <w:tcW w:w="5925" w:type="dxa"/>
             <w:tcBorders/>
             <w:vAlign w:val="center"/>
           </w:tcPr>
@@ -2559,7 +2664,7 @@
         </w:tc>
         <w:tc>
           <w:tcPr>
-            <w:tcW w:w="2985" w:type="dxa"/>
+            <w:tcW w:w="2937" w:type="dxa"/>
             <w:tcBorders/>
             <w:vAlign w:val="center"/>
           </w:tcPr>
@@ -2598,7 +2703,7 @@
         <w:trPr/>
         <w:tc>
           <w:tcPr>
-            <w:tcW w:w="1015" w:type="dxa"/>
+            <w:tcW w:w="1004" w:type="dxa"/>
             <w:tcBorders/>
             <w:vAlign w:val="center"/>
           </w:tcPr>
@@ -2620,7 +2725,7 @@
         </w:tc>
         <w:tc>
           <w:tcPr>
-            <w:tcW w:w="5866" w:type="dxa"/>
+            <w:tcW w:w="5925" w:type="dxa"/>
             <w:tcBorders/>
             <w:vAlign w:val="center"/>
           </w:tcPr>
@@ -2642,7 +2747,7 @@
         </w:tc>
         <w:tc>
           <w:tcPr>
-            <w:tcW w:w="2985" w:type="dxa"/>
+            <w:tcW w:w="2937" w:type="dxa"/>
             <w:tcBorders/>
             <w:vAlign w:val="center"/>
           </w:tcPr>
@@ -2675,7 +2780,7 @@
         <w:trPr/>
         <w:tc>
           <w:tcPr>
-            <w:tcW w:w="1015" w:type="dxa"/>
+            <w:tcW w:w="1004" w:type="dxa"/>
             <w:tcBorders/>
             <w:vAlign w:val="center"/>
           </w:tcPr>
@@ -2701,7 +2806,7 @@
         </w:tc>
         <w:tc>
           <w:tcPr>
-            <w:tcW w:w="5866" w:type="dxa"/>
+            <w:tcW w:w="5925" w:type="dxa"/>
             <w:tcBorders/>
             <w:vAlign w:val="center"/>
           </w:tcPr>
@@ -2743,7 +2848,7 @@
         </w:tc>
         <w:tc>
           <w:tcPr>
-            <w:tcW w:w="2985" w:type="dxa"/>
+            <w:tcW w:w="2937" w:type="dxa"/>
             <w:tcBorders/>
             <w:vAlign w:val="center"/>
           </w:tcPr>
@@ -2778,7 +2883,7 @@
         <w:trPr/>
         <w:tc>
           <w:tcPr>
-            <w:tcW w:w="1015" w:type="dxa"/>
+            <w:tcW w:w="1004" w:type="dxa"/>
             <w:tcBorders/>
             <w:vAlign w:val="center"/>
           </w:tcPr>
@@ -2804,7 +2909,7 @@
         </w:tc>
         <w:tc>
           <w:tcPr>
-            <w:tcW w:w="5866" w:type="dxa"/>
+            <w:tcW w:w="5925" w:type="dxa"/>
             <w:tcBorders/>
             <w:vAlign w:val="center"/>
           </w:tcPr>
@@ -2828,7 +2933,7 @@
         </w:tc>
         <w:tc>
           <w:tcPr>
-            <w:tcW w:w="2985" w:type="dxa"/>
+            <w:tcW w:w="2937" w:type="dxa"/>
             <w:tcBorders/>
             <w:vAlign w:val="center"/>
           </w:tcPr>
@@ -2861,7 +2966,7 @@
         <w:trPr/>
         <w:tc>
           <w:tcPr>
-            <w:tcW w:w="1015" w:type="dxa"/>
+            <w:tcW w:w="1004" w:type="dxa"/>
             <w:tcBorders/>
             <w:vAlign w:val="center"/>
           </w:tcPr>
@@ -2883,7 +2988,7 @@
         </w:tc>
         <w:tc>
           <w:tcPr>
-            <w:tcW w:w="5866" w:type="dxa"/>
+            <w:tcW w:w="5925" w:type="dxa"/>
             <w:tcBorders/>
             <w:vAlign w:val="center"/>
           </w:tcPr>
@@ -2905,7 +3010,7 @@
         </w:tc>
         <w:tc>
           <w:tcPr>
-            <w:tcW w:w="2985" w:type="dxa"/>
+            <w:tcW w:w="2937" w:type="dxa"/>
             <w:tcBorders/>
             <w:vAlign w:val="center"/>
           </w:tcPr>
@@ -2932,7 +3037,7 @@
         <w:trPr/>
         <w:tc>
           <w:tcPr>
-            <w:tcW w:w="1015" w:type="dxa"/>
+            <w:tcW w:w="1004" w:type="dxa"/>
             <w:tcBorders/>
             <w:vAlign w:val="center"/>
           </w:tcPr>
@@ -2954,7 +3059,7 @@
         </w:tc>
         <w:tc>
           <w:tcPr>
-            <w:tcW w:w="5866" w:type="dxa"/>
+            <w:tcW w:w="5925" w:type="dxa"/>
             <w:tcBorders/>
             <w:vAlign w:val="center"/>
           </w:tcPr>
@@ -2980,7 +3085,7 @@
         </w:tc>
         <w:tc>
           <w:tcPr>
-            <w:tcW w:w="2985" w:type="dxa"/>
+            <w:tcW w:w="2937" w:type="dxa"/>
             <w:tcBorders/>
             <w:vAlign w:val="center"/>
           </w:tcPr>
@@ -3029,7 +3134,7 @@
         <w:trPr/>
         <w:tc>
           <w:tcPr>
-            <w:tcW w:w="1015" w:type="dxa"/>
+            <w:tcW w:w="1004" w:type="dxa"/>
             <w:tcBorders/>
             <w:vAlign w:val="center"/>
           </w:tcPr>
@@ -3051,7 +3156,7 @@
         </w:tc>
         <w:tc>
           <w:tcPr>
-            <w:tcW w:w="5866" w:type="dxa"/>
+            <w:tcW w:w="5925" w:type="dxa"/>
             <w:tcBorders/>
             <w:vAlign w:val="center"/>
           </w:tcPr>
@@ -3073,7 +3178,7 @@
         </w:tc>
         <w:tc>
           <w:tcPr>
-            <w:tcW w:w="2985" w:type="dxa"/>
+            <w:tcW w:w="2937" w:type="dxa"/>
             <w:tcBorders/>
             <w:vAlign w:val="center"/>
           </w:tcPr>
@@ -3102,7 +3207,7 @@
         <w:trPr/>
         <w:tc>
           <w:tcPr>
-            <w:tcW w:w="1015" w:type="dxa"/>
+            <w:tcW w:w="1004" w:type="dxa"/>
             <w:tcBorders/>
             <w:vAlign w:val="center"/>
           </w:tcPr>
@@ -3128,7 +3233,7 @@
         </w:tc>
         <w:tc>
           <w:tcPr>
-            <w:tcW w:w="5866" w:type="dxa"/>
+            <w:tcW w:w="5925" w:type="dxa"/>
             <w:tcBorders/>
             <w:vAlign w:val="center"/>
           </w:tcPr>
@@ -3162,7 +3267,7 @@
         </w:tc>
         <w:tc>
           <w:tcPr>
-            <w:tcW w:w="2985" w:type="dxa"/>
+            <w:tcW w:w="2937" w:type="dxa"/>
             <w:tcBorders/>
             <w:vAlign w:val="center"/>
           </w:tcPr>

</xml_diff>

<commit_message>
docs: record sedentary LED verification
</commit_message>
<xml_diff>
--- a/submission/AgentGuard-技术报告.docx
+++ b/submission/AgentGuard-技术报告.docx
@@ -2519,6 +2519,83 @@
             <w:r>
               <w:rPr/>
               <w:t>最终固件刷写后实机人工验收</w:t>
+            </w:r>
+          </w:p>
+        </w:tc>
+      </w:tr>
+      <w:tr>
+        <w:trPr/>
+        <w:tc>
+          <w:tcPr>
+            <w:tcW w:w="1004" w:type="dxa"/>
+            <w:tcBorders/>
+            <w:vAlign w:val="center"/>
+          </w:tcPr>
+          <w:p>
+            <w:pPr>
+              <w:pStyle w:val="TableContents"/>
+              <w:widowControl w:val="false"/>
+              <w:suppressLineNumbers/>
+              <w:bidi w:val="0"/>
+              <w:spacing w:lineRule="auto" w:line="336"/>
+              <w:jc w:val="start"/>
+              <w:rPr/>
+            </w:pPr>
+            <w:r>
+              <w:rPr/>
+              <w:t>久坐灯效</w:t>
+            </w:r>
+          </w:p>
+        </w:tc>
+        <w:tc>
+          <w:tcPr>
+            <w:tcW w:w="5925" w:type="dxa"/>
+            <w:tcBorders/>
+            <w:vAlign w:val="center"/>
+          </w:tcPr>
+          <w:p>
+            <w:pPr>
+              <w:pStyle w:val="TableContents"/>
+              <w:widowControl w:val="false"/>
+              <w:suppressLineNumbers/>
+              <w:bidi w:val="0"/>
+              <w:spacing w:lineRule="auto" w:line="336"/>
+              <w:jc w:val="start"/>
+              <w:rPr/>
+            </w:pPr>
+            <w:r>
+              <w:rPr/>
+              <w:t xml:space="preserve">触发久坐提醒时板载 </w:t>
+            </w:r>
+            <w:r>
+              <w:rPr/>
+              <w:t xml:space="preserve">RGB </w:t>
+            </w:r>
+            <w:r>
+              <w:rPr/>
+              <w:t>灯闪烁</w:t>
+            </w:r>
+          </w:p>
+        </w:tc>
+        <w:tc>
+          <w:tcPr>
+            <w:tcW w:w="2937" w:type="dxa"/>
+            <w:tcBorders/>
+            <w:vAlign w:val="center"/>
+          </w:tcPr>
+          <w:p>
+            <w:pPr>
+              <w:pStyle w:val="TableContents"/>
+              <w:widowControl w:val="false"/>
+              <w:suppressLineNumbers/>
+              <w:bidi w:val="0"/>
+              <w:spacing w:lineRule="auto" w:line="336"/>
+              <w:jc w:val="start"/>
+              <w:rPr/>
+            </w:pPr>
+            <w:r>
+              <w:rPr/>
+              <w:t>最终固件实机人工验收</w:t>
             </w:r>
           </w:p>
         </w:tc>

</xml_diff>

<commit_message>
fix: initialize power LED device
</commit_message>
<xml_diff>
--- a/submission/AgentGuard-技术报告.docx
+++ b/submission/AgentGuard-技术报告.docx
@@ -652,15 +652,15 @@
       </w:r>
       <w:r>
         <w:rPr/>
-        <w:t>、</w:t>
-      </w:r>
-      <w:r>
-        <w:rPr/>
-        <w:t xml:space="preserve">RGB </w:t>
-      </w:r>
-      <w:r>
-        <w:rPr/>
-        <w:t xml:space="preserve">提示灯和 </w:t>
+        <w:t xml:space="preserve">、绿色 </w:t>
+      </w:r>
+      <w:r>
+        <w:rPr/>
+        <w:t xml:space="preserve">Power LED </w:t>
+      </w:r>
+      <w:r>
+        <w:rPr/>
+        <w:t xml:space="preserve">和 </w:t>
       </w:r>
       <w:r>
         <w:rPr/>
@@ -684,7 +684,7 @@
       </w:r>
       <w:r>
         <w:rPr/>
-        <w:t xml:space="preserve">。电脑端采用仅依赖 </w:t>
+        <w:t xml:space="preserve">。电脑端采用 </w:t>
       </w:r>
       <w:r>
         <w:rPr/>
@@ -692,7 +692,29 @@
       </w:r>
       <w:r>
         <w:rPr/>
-        <w:t xml:space="preserve">标准库的安全代理，以 </w:t>
+        <w:t>标准库安全代理（</w:t>
+      </w:r>
+      <w:r>
+        <w:rPr/>
+        <w:t xml:space="preserve">Ubuntu/Debian </w:t>
+      </w:r>
+      <w:r>
+        <w:rPr/>
+        <w:t xml:space="preserve">需安装 </w:t>
+      </w:r>
+      <w:r>
+        <w:rPr>
+          <w:rStyle w:val="SourceText"/>
+        </w:rPr>
+        <w:t>python3-tk</w:t>
+      </w:r>
+      <w:r>
+        <w:rPr/>
+        <w:t xml:space="preserve"> </w:t>
+      </w:r>
+      <w:r>
+        <w:rPr/>
+        <w:t xml:space="preserve">以显示全屏遮罩），以 </w:t>
       </w:r>
       <w:r>
         <w:rPr/>
@@ -840,7 +862,7 @@
         <w:rPr>
           <w:rStyle w:val="SourceText"/>
         </w:rPr>
-        <w:t xml:space="preserve">RGB </w:t>
+        <w:t xml:space="preserve">Power LED </w:t>
       </w:r>
       <w:r>
         <w:rPr>
@@ -1017,7 +1039,7 @@
       </w:r>
       <w:r>
         <w:rPr/>
-        <w:t xml:space="preserve">LCD/RGB/LittleFS </w:t>
+        <w:t xml:space="preserve">LCD/Power LED/LittleFS </w:t>
       </w:r>
       <w:r>
         <w:rPr/>
@@ -1675,13 +1697,13 @@
         <w:rPr>
           <w:rStyle w:val="SourceText"/>
         </w:rPr>
-        <w:t xml:space="preserve">LCD + RGB </w:t>
-      </w:r>
-      <w:r>
-        <w:rPr>
-          <w:rStyle w:val="SourceText"/>
-        </w:rPr>
-        <w:t xml:space="preserve">本地反馈              </w:t>
+        <w:t xml:space="preserve">LCD + Power LED </w:t>
+      </w:r>
+      <w:r>
+        <w:rPr>
+          <w:rStyle w:val="SourceText"/>
+        </w:rPr>
+        <w:t xml:space="preserve">本地反馈        </w:t>
       </w:r>
       <w:r>
         <w:rPr>
@@ -1840,7 +1862,15 @@
       </w:r>
       <w:r>
         <w:rPr/>
-        <w:t xml:space="preserve">RGB LED </w:t>
+        <w:t xml:space="preserve">GPIO3 </w:t>
+      </w:r>
+      <w:r>
+        <w:rPr/>
+        <w:t xml:space="preserve">绿色 </w:t>
+      </w:r>
+      <w:r>
+        <w:rPr/>
+        <w:t xml:space="preserve">Power LED </w:t>
       </w:r>
       <w:r>
         <w:rPr/>
@@ -1852,7 +1882,7 @@
       </w:r>
       <w:r>
         <w:rPr/>
-        <w:t xml:space="preserve">键。本项目没有开发全新硬件平台或新增板级驱动，主要工作是 </w:t>
+        <w:t xml:space="preserve">键。本项目没有开发全新硬件平台，主要工作是 </w:t>
       </w:r>
       <w:r>
         <w:rPr/>
@@ -1860,7 +1890,15 @@
       </w:r>
       <w:r>
         <w:rPr/>
-        <w:t xml:space="preserve">应用与 </w:t>
+        <w:t>应用、</w:t>
+      </w:r>
+      <w:r>
+        <w:rPr/>
+        <w:t xml:space="preserve">Power LED </w:t>
+      </w:r>
+      <w:r>
+        <w:rPr/>
+        <w:t xml:space="preserve">设备注册和 </w:t>
       </w:r>
       <w:r>
         <w:rPr/>
@@ -2543,7 +2581,7 @@
             </w:pPr>
             <w:r>
               <w:rPr/>
-              <w:t>久坐灯效</w:t>
+              <w:t>隐私联动</w:t>
             </w:r>
           </w:p>
         </w:tc>
@@ -2564,16 +2602,40 @@
               <w:rPr/>
             </w:pPr>
             <w:r>
-              <w:rPr/>
-              <w:t xml:space="preserve">触发久坐提醒时板载 </w:t>
-            </w:r>
-            <w:r>
-              <w:rPr/>
-              <w:t xml:space="preserve">RGB </w:t>
-            </w:r>
-            <w:r>
-              <w:rPr/>
-              <w:t>灯闪烁</w:t>
+              <w:rPr>
+                <w:rStyle w:val="SourceText"/>
+              </w:rPr>
+              <w:t>FACE:2</w:t>
+            </w:r>
+            <w:r>
+              <w:rPr/>
+              <w:t xml:space="preserve"> </w:t>
+            </w:r>
+            <w:r>
+              <w:rPr/>
+              <w:t xml:space="preserve">时 </w:t>
+            </w:r>
+            <w:r>
+              <w:rPr/>
+              <w:t xml:space="preserve">Power LED </w:t>
+            </w:r>
+            <w:r>
+              <w:rPr/>
+              <w:t xml:space="preserve">双闪且电脑遮罩出现；回到 </w:t>
+            </w:r>
+            <w:r>
+              <w:rPr>
+                <w:rStyle w:val="SourceText"/>
+              </w:rPr>
+              <w:t>FACE:1</w:t>
+            </w:r>
+            <w:r>
+              <w:rPr/>
+              <w:t xml:space="preserve"> </w:t>
+            </w:r>
+            <w:r>
+              <w:rPr/>
+              <w:t>后遮罩消失</w:t>
             </w:r>
           </w:p>
         </w:tc>
@@ -2595,7 +2657,15 @@
             </w:pPr>
             <w:r>
               <w:rPr/>
-              <w:t>最终固件实机人工验收</w:t>
+              <w:t xml:space="preserve">最终固件通过 </w:t>
+            </w:r>
+            <w:r>
+              <w:rPr/>
+              <w:t xml:space="preserve">USB </w:t>
+            </w:r>
+            <w:r>
+              <w:rPr/>
+              <w:t>连续实测两轮</w:t>
             </w:r>
           </w:p>
         </w:tc>
@@ -2731,7 +2801,7 @@
             </w:pPr>
             <w:r>
               <w:rPr/>
-              <w:t xml:space="preserve">2,414,732 </w:t>
+              <w:t xml:space="preserve">2,414,780 </w:t>
             </w:r>
             <w:r>
               <w:rPr/>
@@ -2899,7 +2969,7 @@
             </w:pPr>
             <w:r>
               <w:rPr/>
-              <w:t>text 1,771,434</w:t>
+              <w:t>text 1,771,562</w:t>
             </w:r>
             <w:r>
               <w:rPr/>
@@ -2907,7 +2977,7 @@
             </w:r>
             <w:r>
               <w:rPr/>
-              <w:t>data 532,072</w:t>
+              <w:t>data 532,120</w:t>
             </w:r>
             <w:r>
               <w:rPr/>
@@ -2915,7 +2985,7 @@
             </w:r>
             <w:r>
               <w:rPr/>
-              <w:t xml:space="preserve">bss 961,944 </w:t>
+              <w:t xml:space="preserve">bss 961,992 </w:t>
             </w:r>
             <w:r>
               <w:rPr/>
@@ -3004,7 +3074,7 @@
               <w:rPr>
                 <w:rStyle w:val="SourceText"/>
               </w:rPr>
-              <w:t>0f37a703e14aa3c38e1281606ac729114f69c3820d2cd74f91e177012139bf2b</w:t>
+              <w:t>fbf3dbe80be3caf31c3f811189180035ad845a362fc63821c46def8100b27ddf</w:t>
             </w:r>
           </w:p>
         </w:tc>
@@ -3026,7 +3096,11 @@
             </w:pPr>
             <w:r>
               <w:rPr/>
-              <w:t xml:space="preserve">新模式底栏版本，已刷写且 </w:t>
+              <w:t xml:space="preserve">Power LED </w:t>
+            </w:r>
+            <w:r>
+              <w:rPr/>
+              <w:t xml:space="preserve">注册修复版，已刷写且 </w:t>
             </w:r>
             <w:r>
               <w:rPr/>

</xml_diff>

<commit_message>
docs: prepare final contest submission materials
Signed-off-by: yhx06 <yan20060509@163.com>
</commit_message>
<xml_diff>
--- a/submission/AgentGuard-技术报告.docx
+++ b/submission/AgentGuard-技术报告.docx
@@ -82,7 +82,7 @@
     </w:p>
     <w:tbl>
       <w:tblPr>
-        <w:tblW w:w="7307" w:type="dxa"/>
+        <w:tblW w:w="9152" w:type="dxa"/>
         <w:jc w:val="start"/>
         <w:tblInd w:w="0" w:type="dxa"/>
         <w:tblLayout w:type="fixed"/>
@@ -95,7 +95,7 @@
       </w:tblPr>
       <w:tblGrid>
         <w:gridCol w:w="841"/>
-        <w:gridCol w:w="6466"/>
+        <w:gridCol w:w="8311"/>
       </w:tblGrid>
       <w:tr>
         <w:trPr/>
@@ -121,7 +121,7 @@
         </w:tc>
         <w:tc>
           <w:tcPr>
-            <w:tcW w:w="6466" w:type="dxa"/>
+            <w:tcW w:w="8311" w:type="dxa"/>
             <w:tcBorders/>
             <w:vAlign w:val="center"/>
           </w:tcPr>
@@ -166,7 +166,7 @@
         </w:tc>
         <w:tc>
           <w:tcPr>
-            <w:tcW w:w="6466" w:type="dxa"/>
+            <w:tcW w:w="8311" w:type="dxa"/>
             <w:tcBorders/>
             <w:vAlign w:val="center"/>
           </w:tcPr>
@@ -225,27 +225,23 @@
         </w:tc>
         <w:tc>
           <w:tcPr>
-            <w:tcW w:w="6466" w:type="dxa"/>
-            <w:tcBorders/>
-            <w:vAlign w:val="center"/>
-          </w:tcPr>
-          <w:p>
-            <w:pPr>
-              <w:pStyle w:val="TableContents"/>
-              <w:widowControl w:val="false"/>
-              <w:suppressLineNumbers/>
-              <w:bidi w:val="0"/>
-              <w:spacing w:lineRule="auto" w:line="336"/>
-              <w:jc w:val="start"/>
-              <w:rPr/>
-            </w:pPr>
-            <w:r>
-              <w:rPr/>
-              <w:t>momohuhuhuluobudui</w:t>
-            </w:r>
-            <w:r>
-              <w:rPr/>
-              <w:t>（仓库登记名）</w:t>
+            <w:tcW w:w="8311" w:type="dxa"/>
+            <w:tcBorders/>
+            <w:vAlign w:val="center"/>
+          </w:tcPr>
+          <w:p>
+            <w:pPr>
+              <w:pStyle w:val="TableContents"/>
+              <w:widowControl w:val="false"/>
+              <w:suppressLineNumbers/>
+              <w:bidi w:val="0"/>
+              <w:spacing w:lineRule="auto" w:line="336"/>
+              <w:jc w:val="start"/>
+              <w:rPr/>
+            </w:pPr>
+            <w:r>
+              <w:rPr/>
+              <w:t>【待填写：报名时登记的正式队伍名称】</w:t>
             </w:r>
           </w:p>
         </w:tc>
@@ -276,27 +272,23 @@
         </w:tc>
         <w:tc>
           <w:tcPr>
-            <w:tcW w:w="6466" w:type="dxa"/>
-            <w:tcBorders/>
-            <w:vAlign w:val="center"/>
-          </w:tcPr>
-          <w:p>
-            <w:pPr>
-              <w:pStyle w:val="TableContents"/>
-              <w:widowControl w:val="false"/>
-              <w:suppressLineNumbers/>
-              <w:bidi w:val="0"/>
-              <w:spacing w:lineRule="auto" w:line="336"/>
-              <w:jc w:val="start"/>
-              <w:rPr/>
-            </w:pPr>
-            <w:r>
-              <w:rPr/>
-              <w:t>yhx06</w:t>
-            </w:r>
-            <w:r>
-              <w:rPr/>
-              <w:t>：产品设计、</w:t>
+            <w:tcW w:w="8311" w:type="dxa"/>
+            <w:tcBorders/>
+            <w:vAlign w:val="center"/>
+          </w:tcPr>
+          <w:p>
+            <w:pPr>
+              <w:pStyle w:val="TableContents"/>
+              <w:widowControl w:val="false"/>
+              <w:suppressLineNumbers/>
+              <w:bidi w:val="0"/>
+              <w:spacing w:lineRule="auto" w:line="336"/>
+              <w:jc w:val="start"/>
+              <w:rPr/>
+            </w:pPr>
+            <w:r>
+              <w:rPr/>
+              <w:t>【待填写：成员真实姓名】——产品设计、</w:t>
             </w:r>
             <w:r>
               <w:rPr/>
@@ -335,7 +327,7 @@
         </w:tc>
         <w:tc>
           <w:tcPr>
-            <w:tcW w:w="6466" w:type="dxa"/>
+            <w:tcW w:w="8311" w:type="dxa"/>
             <w:tcBorders/>
             <w:vAlign w:val="center"/>
           </w:tcPr>
@@ -386,23 +378,23 @@
         </w:tc>
         <w:tc>
           <w:tcPr>
-            <w:tcW w:w="6466" w:type="dxa"/>
-            <w:tcBorders/>
-            <w:vAlign w:val="center"/>
-          </w:tcPr>
-          <w:p>
-            <w:pPr>
-              <w:pStyle w:val="TableContents"/>
-              <w:widowControl w:val="false"/>
-              <w:suppressLineNumbers/>
-              <w:bidi w:val="0"/>
-              <w:spacing w:lineRule="auto" w:line="336"/>
-              <w:jc w:val="start"/>
-              <w:rPr/>
-            </w:pPr>
-            <w:r>
-              <w:rPr/>
-              <w:t>contest2026_123_momohuhuhuluobudui</w:t>
+            <w:tcW w:w="8311" w:type="dxa"/>
+            <w:tcBorders/>
+            <w:vAlign w:val="center"/>
+          </w:tcPr>
+          <w:p>
+            <w:pPr>
+              <w:pStyle w:val="TableContents"/>
+              <w:widowControl w:val="false"/>
+              <w:suppressLineNumbers/>
+              <w:bidi w:val="0"/>
+              <w:spacing w:lineRule="auto" w:line="336"/>
+              <w:jc w:val="start"/>
+              <w:rPr/>
+            </w:pPr>
+            <w:r>
+              <w:rPr/>
+              <w:t>https://github.com/open-vela/contest2026_123_momohuhuhuluobudui</w:t>
             </w:r>
           </w:p>
         </w:tc>

</xml_diff>

<commit_message>
docs: complete AI logs and submission materials
</commit_message>
<xml_diff>
--- a/submission/AgentGuard-技术报告.docx
+++ b/submission/AgentGuard-技术报告.docx
@@ -2160,15 +2160,15 @@
         </w:tblCellMar>
       </w:tblPr>
       <w:tblGrid>
-        <w:gridCol w:w="981"/>
-        <w:gridCol w:w="5921"/>
-        <w:gridCol w:w="2964"/>
+        <w:gridCol w:w="921"/>
+        <w:gridCol w:w="5909"/>
+        <w:gridCol w:w="3036"/>
       </w:tblGrid>
       <w:tr>
         <w:trPr/>
         <w:tc>
           <w:tcPr>
-            <w:tcW w:w="981" w:type="dxa"/>
+            <w:tcW w:w="921" w:type="dxa"/>
             <w:tcBorders/>
             <w:vAlign w:val="center"/>
           </w:tcPr>
@@ -2188,7 +2188,7 @@
         </w:tc>
         <w:tc>
           <w:tcPr>
-            <w:tcW w:w="5921" w:type="dxa"/>
+            <w:tcW w:w="5909" w:type="dxa"/>
             <w:tcBorders/>
             <w:vAlign w:val="center"/>
           </w:tcPr>
@@ -2208,7 +2208,7 @@
         </w:tc>
         <w:tc>
           <w:tcPr>
-            <w:tcW w:w="2964" w:type="dxa"/>
+            <w:tcW w:w="3036" w:type="dxa"/>
             <w:tcBorders/>
             <w:vAlign w:val="center"/>
           </w:tcPr>
@@ -2231,7 +2231,7 @@
         <w:trPr/>
         <w:tc>
           <w:tcPr>
-            <w:tcW w:w="981" w:type="dxa"/>
+            <w:tcW w:w="921" w:type="dxa"/>
             <w:tcBorders/>
             <w:vAlign w:val="center"/>
           </w:tcPr>
@@ -2253,7 +2253,7 @@
         </w:tc>
         <w:tc>
           <w:tcPr>
-            <w:tcW w:w="5921" w:type="dxa"/>
+            <w:tcW w:w="5909" w:type="dxa"/>
             <w:tcBorders/>
             <w:vAlign w:val="center"/>
           </w:tcPr>
@@ -2281,7 +2281,7 @@
         </w:tc>
         <w:tc>
           <w:tcPr>
-            <w:tcW w:w="2964" w:type="dxa"/>
+            <w:tcW w:w="3036" w:type="dxa"/>
             <w:tcBorders/>
             <w:vAlign w:val="center"/>
           </w:tcPr>
@@ -2306,7 +2306,7 @@
         <w:trPr/>
         <w:tc>
           <w:tcPr>
-            <w:tcW w:w="981" w:type="dxa"/>
+            <w:tcW w:w="921" w:type="dxa"/>
             <w:tcBorders/>
             <w:vAlign w:val="center"/>
           </w:tcPr>
@@ -2328,7 +2328,7 @@
         </w:tc>
         <w:tc>
           <w:tcPr>
-            <w:tcW w:w="5921" w:type="dxa"/>
+            <w:tcW w:w="5909" w:type="dxa"/>
             <w:tcBorders/>
             <w:vAlign w:val="center"/>
           </w:tcPr>
@@ -2356,7 +2356,7 @@
         </w:tc>
         <w:tc>
           <w:tcPr>
-            <w:tcW w:w="2964" w:type="dxa"/>
+            <w:tcW w:w="3036" w:type="dxa"/>
             <w:tcBorders/>
             <w:vAlign w:val="center"/>
           </w:tcPr>
@@ -2381,7 +2381,7 @@
         <w:trPr/>
         <w:tc>
           <w:tcPr>
-            <w:tcW w:w="981" w:type="dxa"/>
+            <w:tcW w:w="921" w:type="dxa"/>
             <w:tcBorders/>
             <w:vAlign w:val="center"/>
           </w:tcPr>
@@ -2403,7 +2403,7 @@
         </w:tc>
         <w:tc>
           <w:tcPr>
-            <w:tcW w:w="5921" w:type="dxa"/>
+            <w:tcW w:w="5909" w:type="dxa"/>
             <w:tcBorders/>
             <w:vAlign w:val="center"/>
           </w:tcPr>
@@ -2435,7 +2435,7 @@
         </w:tc>
         <w:tc>
           <w:tcPr>
-            <w:tcW w:w="2964" w:type="dxa"/>
+            <w:tcW w:w="3036" w:type="dxa"/>
             <w:tcBorders/>
             <w:vAlign w:val="center"/>
           </w:tcPr>
@@ -2460,7 +2460,7 @@
         <w:trPr/>
         <w:tc>
           <w:tcPr>
-            <w:tcW w:w="981" w:type="dxa"/>
+            <w:tcW w:w="921" w:type="dxa"/>
             <w:tcBorders/>
             <w:vAlign w:val="center"/>
           </w:tcPr>
@@ -2482,7 +2482,7 @@
         </w:tc>
         <w:tc>
           <w:tcPr>
-            <w:tcW w:w="5921" w:type="dxa"/>
+            <w:tcW w:w="5909" w:type="dxa"/>
             <w:tcBorders/>
             <w:vAlign w:val="center"/>
           </w:tcPr>
@@ -2540,7 +2540,7 @@
         </w:tc>
         <w:tc>
           <w:tcPr>
-            <w:tcW w:w="2964" w:type="dxa"/>
+            <w:tcW w:w="3036" w:type="dxa"/>
             <w:tcBorders/>
             <w:vAlign w:val="center"/>
           </w:tcPr>
@@ -2565,7 +2565,7 @@
         <w:trPr/>
         <w:tc>
           <w:tcPr>
-            <w:tcW w:w="981" w:type="dxa"/>
+            <w:tcW w:w="921" w:type="dxa"/>
             <w:tcBorders/>
             <w:vAlign w:val="center"/>
           </w:tcPr>
@@ -2587,7 +2587,7 @@
         </w:tc>
         <w:tc>
           <w:tcPr>
-            <w:tcW w:w="5921" w:type="dxa"/>
+            <w:tcW w:w="5909" w:type="dxa"/>
             <w:tcBorders/>
             <w:vAlign w:val="center"/>
           </w:tcPr>
@@ -2641,7 +2641,7 @@
         </w:tc>
         <w:tc>
           <w:tcPr>
-            <w:tcW w:w="2964" w:type="dxa"/>
+            <w:tcW w:w="3036" w:type="dxa"/>
             <w:tcBorders/>
             <w:vAlign w:val="center"/>
           </w:tcPr>
@@ -2674,7 +2674,7 @@
         <w:trPr/>
         <w:tc>
           <w:tcPr>
-            <w:tcW w:w="981" w:type="dxa"/>
+            <w:tcW w:w="921" w:type="dxa"/>
             <w:tcBorders/>
             <w:vAlign w:val="center"/>
           </w:tcPr>
@@ -2696,7 +2696,7 @@
         </w:tc>
         <w:tc>
           <w:tcPr>
-            <w:tcW w:w="5921" w:type="dxa"/>
+            <w:tcW w:w="5909" w:type="dxa"/>
             <w:tcBorders/>
             <w:vAlign w:val="center"/>
           </w:tcPr>
@@ -2730,7 +2730,7 @@
         </w:tc>
         <w:tc>
           <w:tcPr>
-            <w:tcW w:w="2964" w:type="dxa"/>
+            <w:tcW w:w="3036" w:type="dxa"/>
             <w:tcBorders/>
             <w:vAlign w:val="center"/>
           </w:tcPr>
@@ -2763,7 +2763,7 @@
         <w:trPr/>
         <w:tc>
           <w:tcPr>
-            <w:tcW w:w="981" w:type="dxa"/>
+            <w:tcW w:w="921" w:type="dxa"/>
             <w:tcBorders/>
             <w:vAlign w:val="center"/>
           </w:tcPr>
@@ -2785,7 +2785,7 @@
         </w:tc>
         <w:tc>
           <w:tcPr>
-            <w:tcW w:w="5921" w:type="dxa"/>
+            <w:tcW w:w="5909" w:type="dxa"/>
             <w:tcBorders/>
             <w:vAlign w:val="center"/>
           </w:tcPr>
@@ -2811,7 +2811,7 @@
         </w:tc>
         <w:tc>
           <w:tcPr>
-            <w:tcW w:w="2964" w:type="dxa"/>
+            <w:tcW w:w="3036" w:type="dxa"/>
             <w:tcBorders/>
             <w:vAlign w:val="center"/>
           </w:tcPr>
@@ -2850,7 +2850,7 @@
         <w:trPr/>
         <w:tc>
           <w:tcPr>
-            <w:tcW w:w="981" w:type="dxa"/>
+            <w:tcW w:w="921" w:type="dxa"/>
             <w:tcBorders/>
             <w:vAlign w:val="center"/>
           </w:tcPr>
@@ -2872,7 +2872,7 @@
         </w:tc>
         <w:tc>
           <w:tcPr>
-            <w:tcW w:w="5921" w:type="dxa"/>
+            <w:tcW w:w="5909" w:type="dxa"/>
             <w:tcBorders/>
             <w:vAlign w:val="center"/>
           </w:tcPr>
@@ -2894,7 +2894,7 @@
         </w:tc>
         <w:tc>
           <w:tcPr>
-            <w:tcW w:w="2964" w:type="dxa"/>
+            <w:tcW w:w="3036" w:type="dxa"/>
             <w:tcBorders/>
             <w:vAlign w:val="center"/>
           </w:tcPr>
@@ -2927,7 +2927,7 @@
         <w:trPr/>
         <w:tc>
           <w:tcPr>
-            <w:tcW w:w="981" w:type="dxa"/>
+            <w:tcW w:w="921" w:type="dxa"/>
             <w:tcBorders/>
             <w:vAlign w:val="center"/>
           </w:tcPr>
@@ -2953,7 +2953,7 @@
         </w:tc>
         <w:tc>
           <w:tcPr>
-            <w:tcW w:w="5921" w:type="dxa"/>
+            <w:tcW w:w="5909" w:type="dxa"/>
             <w:tcBorders/>
             <w:vAlign w:val="center"/>
           </w:tcPr>
@@ -2995,7 +2995,7 @@
         </w:tc>
         <w:tc>
           <w:tcPr>
-            <w:tcW w:w="2964" w:type="dxa"/>
+            <w:tcW w:w="3036" w:type="dxa"/>
             <w:tcBorders/>
             <w:vAlign w:val="center"/>
           </w:tcPr>
@@ -3030,7 +3030,7 @@
         <w:trPr/>
         <w:tc>
           <w:tcPr>
-            <w:tcW w:w="981" w:type="dxa"/>
+            <w:tcW w:w="921" w:type="dxa"/>
             <w:tcBorders/>
             <w:vAlign w:val="center"/>
           </w:tcPr>
@@ -3056,7 +3056,7 @@
         </w:tc>
         <w:tc>
           <w:tcPr>
-            <w:tcW w:w="5921" w:type="dxa"/>
+            <w:tcW w:w="5909" w:type="dxa"/>
             <w:tcBorders/>
             <w:vAlign w:val="center"/>
           </w:tcPr>
@@ -3080,7 +3080,7 @@
         </w:tc>
         <w:tc>
           <w:tcPr>
-            <w:tcW w:w="2964" w:type="dxa"/>
+            <w:tcW w:w="3036" w:type="dxa"/>
             <w:tcBorders/>
             <w:vAlign w:val="center"/>
           </w:tcPr>
@@ -3117,7 +3117,7 @@
         <w:trPr/>
         <w:tc>
           <w:tcPr>
-            <w:tcW w:w="981" w:type="dxa"/>
+            <w:tcW w:w="921" w:type="dxa"/>
             <w:tcBorders/>
             <w:vAlign w:val="center"/>
           </w:tcPr>
@@ -3139,7 +3139,7 @@
         </w:tc>
         <w:tc>
           <w:tcPr>
-            <w:tcW w:w="5921" w:type="dxa"/>
+            <w:tcW w:w="5909" w:type="dxa"/>
             <w:tcBorders/>
             <w:vAlign w:val="center"/>
           </w:tcPr>
@@ -3161,7 +3161,7 @@
         </w:tc>
         <w:tc>
           <w:tcPr>
-            <w:tcW w:w="2964" w:type="dxa"/>
+            <w:tcW w:w="3036" w:type="dxa"/>
             <w:tcBorders/>
             <w:vAlign w:val="center"/>
           </w:tcPr>
@@ -3188,7 +3188,7 @@
         <w:trPr/>
         <w:tc>
           <w:tcPr>
-            <w:tcW w:w="981" w:type="dxa"/>
+            <w:tcW w:w="921" w:type="dxa"/>
             <w:tcBorders/>
             <w:vAlign w:val="center"/>
           </w:tcPr>
@@ -3210,7 +3210,7 @@
         </w:tc>
         <w:tc>
           <w:tcPr>
-            <w:tcW w:w="5921" w:type="dxa"/>
+            <w:tcW w:w="5909" w:type="dxa"/>
             <w:tcBorders/>
             <w:vAlign w:val="center"/>
           </w:tcPr>
@@ -3236,7 +3236,7 @@
         </w:tc>
         <w:tc>
           <w:tcPr>
-            <w:tcW w:w="2964" w:type="dxa"/>
+            <w:tcW w:w="3036" w:type="dxa"/>
             <w:tcBorders/>
             <w:vAlign w:val="center"/>
           </w:tcPr>
@@ -3285,7 +3285,7 @@
         <w:trPr/>
         <w:tc>
           <w:tcPr>
-            <w:tcW w:w="981" w:type="dxa"/>
+            <w:tcW w:w="921" w:type="dxa"/>
             <w:tcBorders/>
             <w:vAlign w:val="center"/>
           </w:tcPr>
@@ -3307,7 +3307,7 @@
         </w:tc>
         <w:tc>
           <w:tcPr>
-            <w:tcW w:w="5921" w:type="dxa"/>
+            <w:tcW w:w="5909" w:type="dxa"/>
             <w:tcBorders/>
             <w:vAlign w:val="center"/>
           </w:tcPr>
@@ -3329,7 +3329,7 @@
         </w:tc>
         <w:tc>
           <w:tcPr>
-            <w:tcW w:w="2964" w:type="dxa"/>
+            <w:tcW w:w="3036" w:type="dxa"/>
             <w:tcBorders/>
             <w:vAlign w:val="center"/>
           </w:tcPr>
@@ -3358,7 +3358,7 @@
         <w:trPr/>
         <w:tc>
           <w:tcPr>
-            <w:tcW w:w="981" w:type="dxa"/>
+            <w:tcW w:w="921" w:type="dxa"/>
             <w:tcBorders/>
             <w:vAlign w:val="center"/>
           </w:tcPr>
@@ -3384,23 +3384,23 @@
         </w:tc>
         <w:tc>
           <w:tcPr>
-            <w:tcW w:w="5921" w:type="dxa"/>
-            <w:tcBorders/>
-            <w:vAlign w:val="center"/>
-          </w:tcPr>
-          <w:p>
-            <w:pPr>
-              <w:pStyle w:val="TableContents"/>
-              <w:widowControl w:val="false"/>
-              <w:suppressLineNumbers/>
-              <w:bidi w:val="0"/>
-              <w:spacing w:lineRule="auto" w:line="336"/>
-              <w:jc w:val="start"/>
-              <w:rPr/>
-            </w:pPr>
-            <w:r>
-              <w:rPr/>
-              <w:t xml:space="preserve">15 </w:t>
+            <w:tcW w:w="5909" w:type="dxa"/>
+            <w:tcBorders/>
+            <w:vAlign w:val="center"/>
+          </w:tcPr>
+          <w:p>
+            <w:pPr>
+              <w:pStyle w:val="TableContents"/>
+              <w:widowControl w:val="false"/>
+              <w:suppressLineNumbers/>
+              <w:bidi w:val="0"/>
+              <w:spacing w:lineRule="auto" w:line="336"/>
+              <w:jc w:val="start"/>
+              <w:rPr/>
+            </w:pPr>
+            <w:r>
+              <w:rPr/>
+              <w:t xml:space="preserve">37 </w:t>
             </w:r>
             <w:r>
               <w:rPr/>
@@ -3408,7 +3408,7 @@
             </w:r>
             <w:r>
               <w:rPr/>
-              <w:t xml:space="preserve">1,820 </w:t>
+              <w:t xml:space="preserve">10,970 </w:t>
             </w:r>
             <w:r>
               <w:rPr/>
@@ -3418,23 +3418,35 @@
         </w:tc>
         <w:tc>
           <w:tcPr>
-            <w:tcW w:w="2964" w:type="dxa"/>
-            <w:tcBorders/>
-            <w:vAlign w:val="center"/>
-          </w:tcPr>
-          <w:p>
-            <w:pPr>
-              <w:pStyle w:val="TableContents"/>
-              <w:widowControl w:val="false"/>
-              <w:suppressLineNumbers/>
-              <w:bidi w:val="0"/>
-              <w:spacing w:lineRule="auto" w:line="336"/>
-              <w:jc w:val="start"/>
-              <w:rPr/>
-            </w:pPr>
-            <w:r>
-              <w:rPr/>
-              <w:t xml:space="preserve">官方 </w:t>
+            <w:tcW w:w="3036" w:type="dxa"/>
+            <w:tcBorders/>
+            <w:vAlign w:val="center"/>
+          </w:tcPr>
+          <w:p>
+            <w:pPr>
+              <w:pStyle w:val="TableContents"/>
+              <w:widowControl w:val="false"/>
+              <w:suppressLineNumbers/>
+              <w:bidi w:val="0"/>
+              <w:spacing w:lineRule="auto" w:line="336"/>
+              <w:jc w:val="start"/>
+              <w:rPr/>
+            </w:pPr>
+            <w:r>
+              <w:rPr/>
+              <w:t xml:space="preserve">Claude Code 15 </w:t>
+            </w:r>
+            <w:r>
+              <w:rPr/>
+              <w:t>会话、</w:t>
+            </w:r>
+            <w:r>
+              <w:rPr/>
+              <w:t xml:space="preserve">Codex 22 </w:t>
+            </w:r>
+            <w:r>
+              <w:rPr/>
+              <w:t xml:space="preserve">会话；官方 </w:t>
             </w:r>
             <w:r>
               <w:rPr>
@@ -3448,7 +3460,7 @@
             </w:r>
             <w:r>
               <w:rPr/>
-              <w:t>校验通过；含个人邮箱的整份旧会话已按隐私规则删除</w:t>
+              <w:t>校验通过，个人信息与令牌已脱敏</w:t>
             </w:r>
           </w:p>
         </w:tc>
@@ -3565,14 +3577,14 @@
         </w:tblCellMar>
       </w:tblPr>
       <w:tblGrid>
-        <w:gridCol w:w="1631"/>
-        <w:gridCol w:w="8235"/>
+        <w:gridCol w:w="1428"/>
+        <w:gridCol w:w="8438"/>
       </w:tblGrid>
       <w:tr>
         <w:trPr/>
         <w:tc>
           <w:tcPr>
-            <w:tcW w:w="1631" w:type="dxa"/>
+            <w:tcW w:w="1428" w:type="dxa"/>
             <w:tcBorders/>
             <w:vAlign w:val="center"/>
           </w:tcPr>
@@ -3592,7 +3604,7 @@
         </w:tc>
         <w:tc>
           <w:tcPr>
-            <w:tcW w:w="8235" w:type="dxa"/>
+            <w:tcW w:w="8438" w:type="dxa"/>
             <w:tcBorders/>
             <w:vAlign w:val="center"/>
           </w:tcPr>
@@ -3615,7 +3627,7 @@
         <w:trPr/>
         <w:tc>
           <w:tcPr>
-            <w:tcW w:w="1631" w:type="dxa"/>
+            <w:tcW w:w="1428" w:type="dxa"/>
             <w:tcBorders/>
             <w:vAlign w:val="center"/>
           </w:tcPr>
@@ -3637,7 +3649,7 @@
         </w:tc>
         <w:tc>
           <w:tcPr>
-            <w:tcW w:w="8235" w:type="dxa"/>
+            <w:tcW w:w="8438" w:type="dxa"/>
             <w:tcBorders/>
             <w:vAlign w:val="center"/>
           </w:tcPr>
@@ -3678,7 +3690,7 @@
         <w:trPr/>
         <w:tc>
           <w:tcPr>
-            <w:tcW w:w="1631" w:type="dxa"/>
+            <w:tcW w:w="1428" w:type="dxa"/>
             <w:tcBorders/>
             <w:vAlign w:val="center"/>
           </w:tcPr>
@@ -3704,7 +3716,7 @@
         </w:tc>
         <w:tc>
           <w:tcPr>
-            <w:tcW w:w="8235" w:type="dxa"/>
+            <w:tcW w:w="8438" w:type="dxa"/>
             <w:tcBorders/>
             <w:vAlign w:val="center"/>
           </w:tcPr>
@@ -3761,7 +3773,7 @@
         <w:trPr/>
         <w:tc>
           <w:tcPr>
-            <w:tcW w:w="1631" w:type="dxa"/>
+            <w:tcW w:w="1428" w:type="dxa"/>
             <w:tcBorders/>
             <w:vAlign w:val="center"/>
           </w:tcPr>
@@ -3783,7 +3795,7 @@
         </w:tc>
         <w:tc>
           <w:tcPr>
-            <w:tcW w:w="8235" w:type="dxa"/>
+            <w:tcW w:w="8438" w:type="dxa"/>
             <w:tcBorders/>
             <w:vAlign w:val="center"/>
           </w:tcPr>
@@ -3808,7 +3820,7 @@
         <w:trPr/>
         <w:tc>
           <w:tcPr>
-            <w:tcW w:w="1631" w:type="dxa"/>
+            <w:tcW w:w="1428" w:type="dxa"/>
             <w:tcBorders/>
             <w:vAlign w:val="center"/>
           </w:tcPr>
@@ -3834,7 +3846,7 @@
         </w:tc>
         <w:tc>
           <w:tcPr>
-            <w:tcW w:w="8235" w:type="dxa"/>
+            <w:tcW w:w="8438" w:type="dxa"/>
             <w:tcBorders/>
             <w:vAlign w:val="center"/>
           </w:tcPr>
@@ -3887,7 +3899,7 @@
         <w:trPr/>
         <w:tc>
           <w:tcPr>
-            <w:tcW w:w="1631" w:type="dxa"/>
+            <w:tcW w:w="1428" w:type="dxa"/>
             <w:tcBorders/>
             <w:vAlign w:val="center"/>
           </w:tcPr>
@@ -3913,7 +3925,7 @@
         </w:tc>
         <w:tc>
           <w:tcPr>
-            <w:tcW w:w="8235" w:type="dxa"/>
+            <w:tcW w:w="8438" w:type="dxa"/>
             <w:tcBorders/>
             <w:vAlign w:val="center"/>
           </w:tcPr>
@@ -3944,7 +3956,7 @@
         <w:trPr/>
         <w:tc>
           <w:tcPr>
-            <w:tcW w:w="1631" w:type="dxa"/>
+            <w:tcW w:w="1428" w:type="dxa"/>
             <w:tcBorders/>
             <w:vAlign w:val="center"/>
           </w:tcPr>
@@ -3970,7 +3982,7 @@
         </w:tc>
         <w:tc>
           <w:tcPr>
-            <w:tcW w:w="8235" w:type="dxa"/>
+            <w:tcW w:w="8438" w:type="dxa"/>
             <w:tcBorders/>
             <w:vAlign w:val="center"/>
           </w:tcPr>
@@ -3990,7 +4002,7 @@
             </w:r>
             <w:r>
               <w:rPr/>
-              <w:t xml:space="preserve">15 </w:t>
+              <w:t xml:space="preserve">37 </w:t>
             </w:r>
             <w:r>
               <w:rPr/>
@@ -3998,7 +4010,7 @@
             </w:r>
             <w:r>
               <w:rPr/>
-              <w:t xml:space="preserve">1,820 </w:t>
+              <w:t xml:space="preserve">10,970 </w:t>
             </w:r>
             <w:r>
               <w:rPr/>
@@ -4006,7 +4018,7 @@
             </w:r>
             <w:r>
               <w:rPr/>
-              <w:t xml:space="preserve">1,910,855 </w:t>
+              <w:t xml:space="preserve">267,275,697 </w:t>
             </w:r>
             <w:r>
               <w:rPr/>
@@ -4014,7 +4026,7 @@
             </w:r>
             <w:r>
               <w:rPr/>
-              <w:t xml:space="preserve">+ 81,241 </w:t>
+              <w:t xml:space="preserve">+ 900,159 </w:t>
             </w:r>
             <w:r>
               <w:rPr/>
@@ -4022,7 +4034,19 @@
             </w:r>
             <w:r>
               <w:rPr/>
-              <w:t>= 1,992,096 Token</w:t>
+              <w:t>= 268,175,856 Token</w:t>
+            </w:r>
+            <w:r>
+              <w:rPr/>
+              <w:t xml:space="preserve">（按各工具报告的累计 </w:t>
+            </w:r>
+            <w:r>
+              <w:rPr/>
+              <w:t xml:space="preserve">usage </w:t>
+            </w:r>
+            <w:r>
+              <w:rPr/>
+              <w:t>口径）</w:t>
             </w:r>
           </w:p>
         </w:tc>
@@ -4031,7 +4055,7 @@
         <w:trPr/>
         <w:tc>
           <w:tcPr>
-            <w:tcW w:w="1631" w:type="dxa"/>
+            <w:tcW w:w="1428" w:type="dxa"/>
             <w:tcBorders/>
             <w:vAlign w:val="center"/>
           </w:tcPr>
@@ -4053,7 +4077,7 @@
         </w:tc>
         <w:tc>
           <w:tcPr>
-            <w:tcW w:w="8235" w:type="dxa"/>
+            <w:tcW w:w="8438" w:type="dxa"/>
             <w:tcBorders/>
             <w:vAlign w:val="center"/>
           </w:tcPr>

</xml_diff>